<commit_message>
test: add DOCX component audit fallback
</commit_message>
<xml_diff>
--- a/validation/fixtures/document-parser-spike-001/ai-event-brief.docx
+++ b/validation/fixtures/document-parser-spike-001/ai-event-brief.docx
@@ -4,29 +4,17 @@
   <w:body>
     <w:p>
       <w:pPr>
-        <w:spacing w:after="80"/>
+        <w:pStyle w:val="FixtureTitle"/>
       </w:pPr>
       <w:r>
-        <w:rPr>
-          <w:rFonts w:ascii="Calibri" w:hAnsi="Calibri"/>
-          <w:b/>
-          <w:color w:val="000000"/>
-          <w:sz w:val="46"/>
-        </w:rPr>
         <w:t>凌川工业增长峰会 AI 工作简报</w:t>
       </w:r>
     </w:p>
     <w:p>
       <w:pPr>
-        <w:spacing w:after="280"/>
+        <w:pStyle w:val="FixtureSubtitle"/>
       </w:pPr>
       <w:r>
-        <w:rPr>
-          <w:rFonts w:ascii="Calibri" w:hAnsi="Calibri"/>
-          <w:b/>
-          <w:color w:val="555555"/>
-          <w:sz w:val="20"/>
-        </w:rPr>
         <w:t>SYNTHETIC FIXTURE | M0-02 document parsing</w:t>
       </w:r>
     </w:p>
@@ -88,15 +76,9 @@
           </w:tcPr>
           <w:p>
             <w:pPr>
-              <w:jc w:val="center"/>
+              <w:pStyle w:val="FixtureTableHeader"/>
             </w:pPr>
             <w:r>
-              <w:rPr>
-                <w:rFonts w:ascii="Calibri" w:hAnsi="Calibri"/>
-                <w:b/>
-                <w:color w:val="000000"/>
-                <w:sz w:val="22"/>
-              </w:rPr>
               <w:t>编号</w:t>
             </w:r>
           </w:p>
@@ -115,15 +97,9 @@
           </w:tcPr>
           <w:p>
             <w:pPr>
-              <w:jc w:val="center"/>
+              <w:pStyle w:val="FixtureTableHeader"/>
             </w:pPr>
             <w:r>
-              <w:rPr>
-                <w:rFonts w:ascii="Calibri" w:hAnsi="Calibri"/>
-                <w:b/>
-                <w:color w:val="000000"/>
-                <w:sz w:val="22"/>
-              </w:rPr>
               <w:t>已确认事实</w:t>
             </w:r>
           </w:p>
@@ -142,15 +118,9 @@
           </w:tcPr>
           <w:p>
             <w:pPr>
-              <w:jc w:val="center"/>
+              <w:pStyle w:val="FixtureTableHeader"/>
             </w:pPr>
             <w:r>
-              <w:rPr>
-                <w:rFonts w:ascii="Calibri" w:hAnsi="Calibri"/>
-                <w:b/>
-                <w:color w:val="000000"/>
-                <w:sz w:val="22"/>
-              </w:rPr>
               <w:t>来源</w:t>
             </w:r>
           </w:p>
@@ -171,11 +141,6 @@
           </w:tcPr>
           <w:p>
             <w:r>
-              <w:rPr>
-                <w:rFonts w:ascii="Calibri" w:hAnsi="Calibri"/>
-                <w:color w:val="000000"/>
-                <w:sz w:val="22"/>
-              </w:rPr>
               <w:t>SRC-DOCX-01</w:t>
             </w:r>
           </w:p>
@@ -193,11 +158,6 @@
           </w:tcPr>
           <w:p>
             <w:r>
-              <w:rPr>
-                <w:rFonts w:ascii="Calibri" w:hAnsi="Calibri"/>
-                <w:color w:val="000000"/>
-                <w:sz w:val="22"/>
-              </w:rPr>
               <w:t>场地容量上限为 360 人。</w:t>
             </w:r>
           </w:p>
@@ -215,11 +175,6 @@
           </w:tcPr>
           <w:p>
             <w:r>
-              <w:rPr>
-                <w:rFonts w:ascii="Calibri" w:hAnsi="Calibri"/>
-                <w:color w:val="000000"/>
-                <w:sz w:val="22"/>
-              </w:rPr>
               <w:t>合成 Brief</w:t>
             </w:r>
           </w:p>
@@ -240,11 +195,6 @@
           </w:tcPr>
           <w:p>
             <w:r>
-              <w:rPr>
-                <w:rFonts w:ascii="Calibri" w:hAnsi="Calibri"/>
-                <w:color w:val="000000"/>
-                <w:sz w:val="22"/>
-              </w:rPr>
               <w:t>SRC-DOCX-02</w:t>
             </w:r>
           </w:p>
@@ -262,11 +212,6 @@
           </w:tcPr>
           <w:p>
             <w:r>
-              <w:rPr>
-                <w:rFonts w:ascii="Calibri" w:hAnsi="Calibri"/>
-                <w:color w:val="000000"/>
-                <w:sz w:val="22"/>
-              </w:rPr>
               <w:t>最终进场清单必须在 2026-10-16 前批准。</w:t>
             </w:r>
           </w:p>
@@ -284,11 +229,6 @@
           </w:tcPr>
           <w:p>
             <w:r>
-              <w:rPr>
-                <w:rFonts w:ascii="Calibri" w:hAnsi="Calibri"/>
-                <w:color w:val="000000"/>
-                <w:sz w:val="22"/>
-              </w:rPr>
               <w:t>合成场地规则</w:t>
             </w:r>
           </w:p>
@@ -309,11 +249,6 @@
           </w:tcPr>
           <w:p>
             <w:r>
-              <w:rPr>
-                <w:rFonts w:ascii="Calibri" w:hAnsi="Calibri"/>
-                <w:color w:val="000000"/>
-                <w:sz w:val="22"/>
-              </w:rPr>
               <w:t>SRC-DOCX-03</w:t>
             </w:r>
           </w:p>
@@ -331,11 +266,6 @@
           </w:tcPr>
           <w:p>
             <w:r>
-              <w:rPr>
-                <w:rFonts w:ascii="Calibri" w:hAnsi="Calibri"/>
-                <w:color w:val="000000"/>
-                <w:sz w:val="22"/>
-              </w:rPr>
               <w:t>正式排期变更需要项目负责人批准。</w:t>
             </w:r>
           </w:p>
@@ -353,11 +283,6 @@
           </w:tcPr>
           <w:p>
             <w:r>
-              <w:rPr>
-                <w:rFonts w:ascii="Calibri" w:hAnsi="Calibri"/>
-                <w:color w:val="000000"/>
-                <w:sz w:val="22"/>
-              </w:rPr>
               <w:t>合成审批规则</w:t>
             </w:r>
           </w:p>
@@ -428,15 +353,9 @@
           </w:tcPr>
           <w:p>
             <w:pPr>
-              <w:jc w:val="center"/>
+              <w:pStyle w:val="FixtureTableHeader"/>
             </w:pPr>
             <w:r>
-              <w:rPr>
-                <w:rFonts w:ascii="Calibri" w:hAnsi="Calibri"/>
-                <w:b/>
-                <w:color w:val="000000"/>
-                <w:sz w:val="22"/>
-              </w:rPr>
               <w:t>变更编号</w:t>
             </w:r>
           </w:p>
@@ -455,15 +374,9 @@
           </w:tcPr>
           <w:p>
             <w:pPr>
-              <w:jc w:val="center"/>
+              <w:pStyle w:val="FixtureTableHeader"/>
             </w:pPr>
             <w:r>
-              <w:rPr>
-                <w:rFonts w:ascii="Calibri" w:hAnsi="Calibri"/>
-                <w:b/>
-                <w:color w:val="000000"/>
-                <w:sz w:val="22"/>
-              </w:rPr>
               <w:t>影响对象</w:t>
             </w:r>
           </w:p>
@@ -482,15 +395,9 @@
           </w:tcPr>
           <w:p>
             <w:pPr>
-              <w:jc w:val="center"/>
+              <w:pStyle w:val="FixtureTableHeader"/>
             </w:pPr>
             <w:r>
-              <w:rPr>
-                <w:rFonts w:ascii="Calibri" w:hAnsi="Calibri"/>
-                <w:b/>
-                <w:color w:val="000000"/>
-                <w:sz w:val="22"/>
-              </w:rPr>
               <w:t>状态</w:t>
             </w:r>
           </w:p>
@@ -509,15 +416,9 @@
           </w:tcPr>
           <w:p>
             <w:pPr>
-              <w:jc w:val="center"/>
+              <w:pStyle w:val="FixtureTableHeader"/>
             </w:pPr>
             <w:r>
-              <w:rPr>
-                <w:rFonts w:ascii="Calibri" w:hAnsi="Calibri"/>
-                <w:b/>
-                <w:color w:val="000000"/>
-                <w:sz w:val="22"/>
-              </w:rPr>
               <w:t>审批角色</w:t>
             </w:r>
           </w:p>
@@ -538,11 +439,6 @@
           </w:tcPr>
           <w:p>
             <w:r>
-              <w:rPr>
-                <w:rFonts w:ascii="Calibri" w:hAnsi="Calibri"/>
-                <w:color w:val="000000"/>
-                <w:sz w:val="22"/>
-              </w:rPr>
               <w:t>CHG-DOCX-01</w:t>
             </w:r>
           </w:p>
@@ -560,11 +456,6 @@
           </w:tcPr>
           <w:p>
             <w:r>
-              <w:rPr>
-                <w:rFonts w:ascii="Calibri" w:hAnsi="Calibri"/>
-                <w:color w:val="000000"/>
-                <w:sz w:val="22"/>
-              </w:rPr>
               <w:t>DEL-03 / TASK-080</w:t>
             </w:r>
           </w:p>
@@ -582,11 +473,6 @@
           </w:tcPr>
           <w:p>
             <w:r>
-              <w:rPr>
-                <w:rFonts w:ascii="Calibri" w:hAnsi="Calibri"/>
-                <w:color w:val="000000"/>
-                <w:sz w:val="22"/>
-              </w:rPr>
               <w:t>待审批</w:t>
             </w:r>
           </w:p>
@@ -604,11 +490,6 @@
           </w:tcPr>
           <w:p>
             <w:r>
-              <w:rPr>
-                <w:rFonts w:ascii="Calibri" w:hAnsi="Calibri"/>
-                <w:color w:val="000000"/>
-                <w:sz w:val="22"/>
-              </w:rPr>
               <w:t>项目负责人</w:t>
             </w:r>
           </w:p>
@@ -629,11 +510,6 @@
           </w:tcPr>
           <w:p>
             <w:r>
-              <w:rPr>
-                <w:rFonts w:ascii="Calibri" w:hAnsi="Calibri"/>
-                <w:color w:val="000000"/>
-                <w:sz w:val="22"/>
-              </w:rPr>
               <w:t>CHG-DOCX-02</w:t>
             </w:r>
           </w:p>
@@ -651,11 +527,6 @@
           </w:tcPr>
           <w:p>
             <w:r>
-              <w:rPr>
-                <w:rFonts w:ascii="Calibri" w:hAnsi="Calibri"/>
-                <w:color w:val="000000"/>
-                <w:sz w:val="22"/>
-              </w:rPr>
               <w:t>无正式影响</w:t>
             </w:r>
           </w:p>
@@ -673,11 +544,6 @@
           </w:tcPr>
           <w:p>
             <w:r>
-              <w:rPr>
-                <w:rFonts w:ascii="Calibri" w:hAnsi="Calibri"/>
-                <w:color w:val="000000"/>
-                <w:sz w:val="22"/>
-              </w:rPr>
               <w:t>已驳回</w:t>
             </w:r>
           </w:p>
@@ -695,11 +561,6 @@
           </w:tcPr>
           <w:p>
             <w:r>
-              <w:rPr>
-                <w:rFonts w:ascii="Calibri" w:hAnsi="Calibri"/>
-                <w:color w:val="000000"/>
-                <w:sz w:val="22"/>
-              </w:rPr>
               <w:t>市场负责人</w:t>
             </w:r>
           </w:p>
@@ -12770,6 +12631,43 @@
         <w:shd w:val="clear" w:color="auto" w:fill="FBCAA2" w:themeFill="accent6" w:themeFillTint="7F"/>
       </w:tcPr>
     </w:tblStylePr>
+  </w:style>
+  <w:style w:type="paragraph" w:customStyle="1" w:styleId="FixtureTitle">
+    <w:name w:val="Fixture Title"/>
+    <w:pPr>
+      <w:spacing w:before="0" w:after="80" w:line="240" w:lineRule="auto"/>
+    </w:pPr>
+    <w:rPr>
+      <w:rFonts w:ascii="Calibri" w:hAnsi="Calibri"/>
+      <w:b/>
+      <w:color w:val="000000"/>
+      <w:sz w:val="46"/>
+    </w:rPr>
+  </w:style>
+  <w:style w:type="paragraph" w:customStyle="1" w:styleId="FixtureSubtitle">
+    <w:name w:val="Fixture Subtitle"/>
+    <w:pPr>
+      <w:spacing w:before="0" w:after="280" w:line="240" w:lineRule="auto"/>
+    </w:pPr>
+    <w:rPr>
+      <w:rFonts w:ascii="Calibri" w:hAnsi="Calibri"/>
+      <w:b/>
+      <w:color w:val="555555"/>
+      <w:sz w:val="20"/>
+    </w:rPr>
+  </w:style>
+  <w:style w:type="paragraph" w:customStyle="1" w:styleId="FixtureTableHeader">
+    <w:name w:val="Fixture Table Header"/>
+    <w:pPr>
+      <w:spacing w:before="0" w:after="0" w:line="240" w:lineRule="auto"/>
+      <w:jc w:val="center"/>
+    </w:pPr>
+    <w:rPr>
+      <w:rFonts w:ascii="Calibri" w:hAnsi="Calibri"/>
+      <w:b/>
+      <w:color w:val="000000"/>
+      <w:sz w:val="22"/>
+    </w:rPr>
   </w:style>
 </w:styles>
 </file>

</xml_diff>